<commit_message>
feat: enhance typography variety and layout elegance
</commit_message>
<xml_diff>
--- a/CV_Hafiz_Kurniawan.docx
+++ b/CV_Hafiz_Kurniawan.docx
@@ -1444,8 +1444,45 @@
         <w:pStyle w:val="ListBullet"/>
         <w:spacing w:after="80"/>
       </w:pPr>
-      <w:r>
-        <w:t>Lolos babak penyisihan kompetisi UI/UX tingkat Nasional yang diselenggarakan oleh HMIF Institut Teknologi Bandung (ITB).</w:t>
+      <w:proofErr w:type="spellStart"/>
+      <w:r>
+        <w:t>Berpartisipasi</w:t>
+      </w:r>
+      <w:proofErr w:type="spellEnd"/>
+      <w:r>
+        <w:t xml:space="preserve"> </w:t>
+      </w:r>
+      <w:proofErr w:type="spellStart"/>
+      <w:r>
+        <w:t>dalam</w:t>
+      </w:r>
+      <w:proofErr w:type="spellEnd"/>
+      <w:r>
+        <w:t xml:space="preserve"> </w:t>
+      </w:r>
+      <w:proofErr w:type="spellStart"/>
+      <w:r>
+        <w:t>babak</w:t>
+      </w:r>
+      <w:proofErr w:type="spellEnd"/>
+      <w:r>
+        <w:t xml:space="preserve"> </w:t>
+      </w:r>
+      <w:proofErr w:type="spellStart"/>
+      <w:r>
+        <w:t>penyisihan</w:t>
+      </w:r>
+      <w:proofErr w:type="spellEnd"/>
+      <w:r>
+        <w:t xml:space="preserve"> </w:t>
+      </w:r>
+      <w:proofErr w:type="spellStart"/>
+      <w:r>
+        <w:t>kompetisi</w:t>
+      </w:r>
+      <w:proofErr w:type="spellEnd"/>
+      <w:r>
+        <w:t xml:space="preserve"> UI/UX tingkat Nasional yang diselenggarakan oleh HMIF Institut Teknologi Bandung (ITB).</w:t>
       </w:r>
     </w:p>
     <w:p>

</xml_diff>